<commit_message>
Clarify Section 11 claim limitations and connect editable flow to the Word disclosure
</commit_message>
<xml_diff>
--- a/training/section-11/patent-packet/output/patent-draft.docx
+++ b/training/section-11/patent-packet/output/patent-draft.docx
@@ -35,7 +35,7 @@
     </w:p>
     <w:p>
       <w:r>
-        <w:t>US7255669B2说明书及权利要求15涉及随转速变化的阈值与停止控制。EP4636367A1于2025年10月22日公开，权利要求1至4涉及多自由度振动数据、状态识别和经训练模型。可见传感、判断与控制已有公开技术涉及。本例尚未形成经核实的区别特征，不据此判断新颖性、创造性或实施自由。</w:t>
+        <w:t>US7255669B2权利要求15写明机架、阻尼支撑、驱动与转动件，超幅振动时部件接触产生冲击；控制单元设置随转速变化的阈值，检测输出超过阈值时停止驱动。EP4636367A1于2025年10月22日公开，权利要求1涉及至少两个自由度的振动数据及模式识别；权利要求3引用前项并增加训练模型，权利要求4引用3并增加特征表示。权利要求11在引用前述任一项的基础上增加按运行状态停止操作。本段仅列已读部分，没有穷尽两份文献的所有限定。本例尚未形成经核实的区别特征，不据此判断新颖性、创造性或实施自由。</w:t>
         <w:br/>
         <w:t>依据：US, EP, SIM</w:t>
       </w:r>
@@ -52,7 +52,7 @@
       <w:r>
         <w:t>课程拟设想在已有振动检测之外加入传感数据有效性检查：读取各轴数据及时间标记，检查丢帧、饱和等条件；数据有效时进入状态识别，数据异常时记录故障并向控制单元发出处理请求。控制单元如何接收请求、执行何种动作以及何时恢复，均需设备设计与安全验证支持。</w:t>
         <w:br/>
-        <w:t>流程步骤S1读取数据，S2检查数据有效性，S3在有效数据上识别状态，S4记录异常并请求控制处理。当前未给定安装位置、采样率、窗口长度、故障门槛和制动参数，不能据此制造或控制真实离心机。上述流程不宣称区别于现有技术。</w:t>
+        <w:t>流程步骤S1读取数据，S2检查数据有效性，S3在有效数据上识别状态，S4记录传感故障；正常识别和故障路径均形成控制处理请求。当前未给定安装位置、采样率、窗口长度、故障门槛和制动参数，不能据此制造或控制真实离心机。上述流程不宣称区别于现有技术。</w:t>
         <w:br/>
         <w:t>依据：SIM</w:t>
       </w:r>
@@ -66,8 +66,11 @@
       </w:r>
     </w:p>
     <w:p>
+      <w:pPr>
+        <w:keepLines/>
+      </w:pPr>
       <w:r>
-        <w:t>教学图中模块分别为传感输入、数据有效性检查、状态识别、事件记录和控制请求。连接表示拟议信息路径，不是硬件接线图或已完成系统。随包方案流程.mmd保留可编辑源；公开专利图另标注文件号与图号，不能当作本例结构图。</w:t>
+        <w:t>教学图以S1标记传感数据与时间标记，S2标记数据有效性判断，S3标记正常路径的状态识别，S4标记异常路径的故障记录。两条路径汇入控制处理请求，处理与恢复规则仍待验证。连接表示拟议信息路径，不是硬件接线图或已完成系统。Word附图使用与PPT相同的流程定义，PNG随实际文件流程嵌入，draw.io、SVG和JSON编辑源另附。公开专利图另标注文件号与图号，不当作本例结构图。</w:t>
         <w:br/>
         <w:t>依据：SIM</w:t>
       </w:r>
@@ -155,8 +158,95 @@
         <w:t>HUMAN-SIGNOFF  需要研究者对输入和模板的当前版本签核</w:t>
       </w:r>
     </w:p>
+    <w:p>
+      <w:r>
+        <w:br w:type="page"/>
+      </w:r>
+    </w:p>
+    <w:p>
+      <w:pPr>
+        <w:pStyle w:val="Heading1"/>
+      </w:pPr>
+      <w:r>
+        <w:t>教学方案流程与步骤标记</w:t>
+      </w:r>
+    </w:p>
+    <w:p>
+      <w:r>
+        <w:t>图中S1至S4与实施说明对应。图示只说明拟议信息路径，没有样机、接线或控制验证；处理与恢复规则仍待提供。可编辑JSON、draw.io和SVG另附。</w:t>
+      </w:r>
+    </w:p>
+    <w:p>
+      <w:r>
+        <w:t>教学方案信息流程 无样机与控制验证</w:t>
+      </w:r>
+    </w:p>
+    <w:p>
+      <w:r>
+        <w:drawing>
+          <wp:inline xmlns:a="http://schemas.openxmlformats.org/drawingml/2006/main" xmlns:pic="http://schemas.openxmlformats.org/drawingml/2006/picture">
+            <wp:extent cx="5760000" cy="2522024"/>
+            <wp:docPr id="1" name="Picture 1"/>
+            <wp:cNvGraphicFramePr>
+              <a:graphicFrameLocks noChangeAspect="1"/>
+            </wp:cNvGraphicFramePr>
+            <a:graphic>
+              <a:graphicData uri="http://schemas.openxmlformats.org/drawingml/2006/picture">
+                <pic:pic>
+                  <pic:nvPicPr>
+                    <pic:cNvPr id="0" name="教学方案流程.png"/>
+                    <pic:cNvPicPr/>
+                  </pic:nvPicPr>
+                  <pic:blipFill>
+                    <a:blip r:embed="rId9"/>
+                    <a:stretch>
+                      <a:fillRect/>
+                    </a:stretch>
+                  </pic:blipFill>
+                  <pic:spPr>
+                    <a:xfrm>
+                      <a:off x="0" y="0"/>
+                      <a:ext cx="5760000" cy="2522024"/>
+                    </a:xfrm>
+                    <a:prstGeom prst="rect"/>
+                  </pic:spPr>
+                </pic:pic>
+              </a:graphicData>
+            </a:graphic>
+          </wp:inline>
+        </w:drawing>
+      </w:r>
+    </w:p>
+    <w:p>
+      <w:pPr>
+        <w:pStyle w:val="Heading2"/>
+      </w:pPr>
+      <w:r>
+        <w:t>步骤对应的待补材料</w:t>
+      </w:r>
+    </w:p>
+    <w:p>
+      <w:r>
+        <w:t>S1：需补传感器安装位置、数据格式和时间标记来源。</w:t>
+      </w:r>
+    </w:p>
+    <w:p>
+      <w:r>
+        <w:t>S2：需补丢帧、饱和等判据，以及门槛的测试依据。</w:t>
+      </w:r>
+    </w:p>
+    <w:p>
+      <w:r>
+        <w:t>S3：需补运行状态的识别方法、输入要求与验证记录。</w:t>
+      </w:r>
+    </w:p>
+    <w:p>
+      <w:r>
+        <w:t>S4：需补故障记录字段、请求接口、处理与恢复规则。</w:t>
+      </w:r>
+    </w:p>
     <w:sectPr>
-      <w:pgSz w:w="12240" w:h="15840"/>
+      <w:pgSz w:w="11906" w:h="16838"/>
       <w:pgMar w:top="1134" w:right="1247" w:bottom="1134" w:left="1247" w:header="720" w:footer="720" w:gutter="0"/>
       <w:cols w:space="720"/>
       <w:docGrid w:linePitch="360"/>
@@ -529,7 +619,7 @@
     <w:qFormat/>
     <w:rsid w:val="00FC693F"/>
     <w:pPr>
-      <w:spacing w:after="160"/>
+      <w:spacing w:after="120" w:line="240" w:lineRule="auto"/>
     </w:pPr>
     <w:rPr>
       <w:rFonts w:ascii="Microsoft YaHei" w:hAnsi="Microsoft YaHei" w:eastAsia="Microsoft YaHei"/>
@@ -885,7 +975,7 @@
       <w:color w:val="000000"/>
       <w:spacing w:val="5"/>
       <w:kern w:val="28"/>
-      <w:sz w:val="52"/>
+      <w:sz w:val="36"/>
       <w:szCs w:val="52"/>
     </w:rPr>
   </w:style>

</xml_diff>